<commit_message>
docs: add project URL to manual, disable Jekyll on Pages
.nojekyll stops GitHub Pages from wrapping docs/index.html in the
default theme header once the Pages source moves to /docs.

Co-Authored-By: Claude Sonnet 5 <noreply@anthropic.com>
</commit_message>
<xml_diff>
--- a/docs/Sygnia-Design-Manual.docx
+++ b/docs/Sygnia-Design-Manual.docx
@@ -69,6 +69,14 @@
         <w:t>Audience: junior developers and non-technical stakeholders.</w:t>
         <w:br/>
         <w:t>No prior familiarity with the codebase is assumed.</w:t>
+      </w:r>
+    </w:p>
+    <w:p>
+      <w:r>
+        <w:rPr>
+          <w:i/>
+        </w:rPr>
+        <w:t>Project site: https://johanccs.github.io/Sygnia_Cash-Movements/</w:t>
       </w:r>
     </w:p>
     <w:p>

</xml_diff>

<commit_message>
docs: add audit procedure, observability, and testing evidence sections
- 9. Audit Procedure for Duplicate Conflicts: explains AuditConflictAsync
  and the MovementConflictAudits table added in the previous PR.
- 10. Observability: Seq structured logs and Jaeger distributed traces,
  with live screenshots.
- 11. Testing Evidence: Postman gRPC invocation (server reflection) and
  GitHub Actions CI run history/detail, with live screenshots.
- Corrects the "Currency normalisation" Known Limitations item, which
  was resolved in the code-quality loop but never updated in the manual.
</commit_message>
<xml_diff>
--- a/docs/Sygnia-Design-Manual.docx
+++ b/docs/Sygnia-Design-Manual.docx
@@ -72,6 +72,10 @@
       </w:r>
     </w:p>
     <w:p>
+      <w:pPr>
+        <w:pStyle w:val="Normal"/>
+        <w:rPr/>
+      </w:pPr>
       <w:r>
         <w:rPr>
           <w:i/>
@@ -109,7 +113,31 @@
       </w:pPr>
       <w:r>
         <w:rPr/>
-        <w:t>Sygnia is a small but production-shaped banking backend built to demonstrate how a financial system should handle money movements safely. It lets a client record a cash movement (a deposit or withdrawal) against an account, transfer money between two accounts in one atomic step, check an account's balance, and download a full statement of an account's history.</w:t>
+        <w:t xml:space="preserve">Sygnia </w:t>
+      </w:r>
+      <w:r>
+        <w:rPr/>
+        <w:t>Cash Movement</w:t>
+      </w:r>
+      <w:r>
+        <w:rPr/>
+        <w:t xml:space="preserve"> is a small but production-shaped </w:t>
+      </w:r>
+      <w:r>
+        <w:rPr/>
+        <w:t>demo</w:t>
+      </w:r>
+      <w:r>
+        <w:rPr/>
+        <w:t xml:space="preserve"> backend built to demonstrat</w:t>
+      </w:r>
+      <w:r>
+        <w:rPr/>
+        <w:t xml:space="preserve">e cash </w:t>
+      </w:r>
+      <w:r>
+        <w:rPr/>
+        <w:t>movements.</w:t>
       </w:r>
     </w:p>
     <w:p>
@@ -119,7 +147,7 @@
       </w:pPr>
       <w:r>
         <w:rPr/>
-        <w:t>In plain terms: this is the kind of system a bank's core ledger relies on. Two properties make or break a system like this, and both are treated as first-class design goals rather than afterthoughts:</w:t>
+        <w:t>Two properties make or break a system like this, and both are treated as first-class design goals rather than afterthoughts:</w:t>
       </w:r>
     </w:p>
     <w:p>
@@ -224,6 +252,7 @@
             <w:pPr>
               <w:pStyle w:val="Normal"/>
               <w:widowControl/>
+              <w:suppressAutoHyphens w:val="true"/>
               <w:spacing w:lineRule="auto" w:line="240" w:before="0" w:after="0"/>
               <w:jc w:val="center"/>
               <w:rPr>
@@ -257,6 +286,7 @@
             <w:pPr>
               <w:pStyle w:val="Normal"/>
               <w:widowControl/>
+              <w:suppressAutoHyphens w:val="true"/>
               <w:spacing w:lineRule="auto" w:line="240" w:before="0" w:after="0"/>
               <w:jc w:val="center"/>
               <w:rPr>
@@ -290,6 +320,7 @@
             <w:pPr>
               <w:pStyle w:val="Normal"/>
               <w:widowControl/>
+              <w:suppressAutoHyphens w:val="true"/>
               <w:spacing w:lineRule="auto" w:line="240" w:before="0" w:after="0"/>
               <w:jc w:val="center"/>
               <w:rPr>
@@ -325,6 +356,7 @@
             <w:pPr>
               <w:pStyle w:val="Normal"/>
               <w:widowControl/>
+              <w:suppressAutoHyphens w:val="true"/>
               <w:spacing w:lineRule="auto" w:line="240" w:before="0" w:after="0"/>
               <w:jc w:val="center"/>
               <w:rPr>
@@ -356,6 +388,7 @@
             <w:pPr>
               <w:pStyle w:val="Normal"/>
               <w:widowControl/>
+              <w:suppressAutoHyphens w:val="true"/>
               <w:spacing w:lineRule="auto" w:line="240" w:before="0" w:after="0"/>
               <w:jc w:val="start"/>
               <w:rPr>
@@ -387,6 +420,7 @@
             <w:pPr>
               <w:pStyle w:val="Normal"/>
               <w:widowControl/>
+              <w:suppressAutoHyphens w:val="true"/>
               <w:spacing w:lineRule="auto" w:line="240" w:before="0" w:after="0"/>
               <w:jc w:val="start"/>
               <w:rPr>
@@ -422,6 +456,7 @@
             <w:pPr>
               <w:pStyle w:val="Normal"/>
               <w:widowControl/>
+              <w:suppressAutoHyphens w:val="true"/>
               <w:spacing w:lineRule="auto" w:line="240" w:before="0" w:after="0"/>
               <w:jc w:val="center"/>
               <w:rPr>
@@ -454,6 +489,7 @@
             <w:pPr>
               <w:pStyle w:val="Normal"/>
               <w:widowControl/>
+              <w:suppressAutoHyphens w:val="true"/>
               <w:spacing w:lineRule="auto" w:line="240" w:before="0" w:after="0"/>
               <w:jc w:val="start"/>
               <w:rPr>
@@ -486,6 +522,7 @@
             <w:pPr>
               <w:pStyle w:val="Normal"/>
               <w:widowControl/>
+              <w:suppressAutoHyphens w:val="true"/>
               <w:spacing w:lineRule="auto" w:line="240" w:before="0" w:after="0"/>
               <w:jc w:val="start"/>
               <w:rPr>
@@ -520,6 +557,7 @@
             <w:pPr>
               <w:pStyle w:val="Normal"/>
               <w:widowControl/>
+              <w:suppressAutoHyphens w:val="true"/>
               <w:spacing w:lineRule="auto" w:line="240" w:before="0" w:after="0"/>
               <w:jc w:val="center"/>
               <w:rPr>
@@ -551,6 +589,7 @@
             <w:pPr>
               <w:pStyle w:val="Normal"/>
               <w:widowControl/>
+              <w:suppressAutoHyphens w:val="true"/>
               <w:spacing w:lineRule="auto" w:line="240" w:before="0" w:after="0"/>
               <w:jc w:val="start"/>
               <w:rPr>
@@ -582,6 +621,7 @@
             <w:pPr>
               <w:pStyle w:val="Normal"/>
               <w:widowControl/>
+              <w:suppressAutoHyphens w:val="true"/>
               <w:spacing w:lineRule="auto" w:line="240" w:before="0" w:after="0"/>
               <w:jc w:val="start"/>
               <w:rPr>
@@ -617,6 +657,7 @@
             <w:pPr>
               <w:pStyle w:val="Normal"/>
               <w:widowControl/>
+              <w:suppressAutoHyphens w:val="true"/>
               <w:spacing w:lineRule="auto" w:line="240" w:before="0" w:after="0"/>
               <w:jc w:val="center"/>
               <w:rPr>
@@ -649,6 +690,7 @@
             <w:pPr>
               <w:pStyle w:val="Normal"/>
               <w:widowControl/>
+              <w:suppressAutoHyphens w:val="true"/>
               <w:spacing w:lineRule="auto" w:line="240" w:before="0" w:after="0"/>
               <w:jc w:val="start"/>
               <w:rPr>
@@ -681,6 +723,7 @@
             <w:pPr>
               <w:pStyle w:val="Normal"/>
               <w:widowControl/>
+              <w:suppressAutoHyphens w:val="true"/>
               <w:spacing w:lineRule="auto" w:line="240" w:before="0" w:after="0"/>
               <w:jc w:val="start"/>
               <w:rPr>
@@ -715,6 +758,7 @@
             <w:pPr>
               <w:pStyle w:val="Normal"/>
               <w:widowControl/>
+              <w:suppressAutoHyphens w:val="true"/>
               <w:spacing w:lineRule="auto" w:line="240" w:before="0" w:after="0"/>
               <w:jc w:val="center"/>
               <w:rPr>
@@ -746,6 +790,7 @@
             <w:pPr>
               <w:pStyle w:val="Normal"/>
               <w:widowControl/>
+              <w:suppressAutoHyphens w:val="true"/>
               <w:spacing w:lineRule="auto" w:line="240" w:before="0" w:after="0"/>
               <w:jc w:val="start"/>
               <w:rPr>
@@ -777,6 +822,7 @@
             <w:pPr>
               <w:pStyle w:val="Normal"/>
               <w:widowControl/>
+              <w:suppressAutoHyphens w:val="true"/>
               <w:spacing w:lineRule="auto" w:line="240" w:before="0" w:after="0"/>
               <w:jc w:val="start"/>
               <w:rPr>
@@ -812,6 +858,7 @@
             <w:pPr>
               <w:pStyle w:val="Normal"/>
               <w:widowControl/>
+              <w:suppressAutoHyphens w:val="true"/>
               <w:spacing w:lineRule="auto" w:line="240" w:before="0" w:after="0"/>
               <w:jc w:val="center"/>
               <w:rPr>
@@ -844,6 +891,7 @@
             <w:pPr>
               <w:pStyle w:val="Normal"/>
               <w:widowControl/>
+              <w:suppressAutoHyphens w:val="true"/>
               <w:spacing w:lineRule="auto" w:line="240" w:before="0" w:after="0"/>
               <w:jc w:val="start"/>
               <w:rPr>
@@ -876,6 +924,7 @@
             <w:pPr>
               <w:pStyle w:val="Normal"/>
               <w:widowControl/>
+              <w:suppressAutoHyphens w:val="true"/>
               <w:spacing w:lineRule="auto" w:line="240" w:before="0" w:after="0"/>
               <w:jc w:val="start"/>
               <w:rPr>
@@ -910,6 +959,7 @@
             <w:pPr>
               <w:pStyle w:val="Normal"/>
               <w:widowControl/>
+              <w:suppressAutoHyphens w:val="true"/>
               <w:spacing w:lineRule="auto" w:line="240" w:before="0" w:after="0"/>
               <w:jc w:val="center"/>
               <w:rPr>
@@ -941,6 +991,7 @@
             <w:pPr>
               <w:pStyle w:val="Normal"/>
               <w:widowControl/>
+              <w:suppressAutoHyphens w:val="true"/>
               <w:spacing w:lineRule="auto" w:line="240" w:before="0" w:after="0"/>
               <w:jc w:val="start"/>
               <w:rPr>
@@ -972,6 +1023,7 @@
             <w:pPr>
               <w:pStyle w:val="Normal"/>
               <w:widowControl/>
+              <w:suppressAutoHyphens w:val="true"/>
               <w:spacing w:lineRule="auto" w:line="240" w:before="0" w:after="0"/>
               <w:jc w:val="start"/>
               <w:rPr>
@@ -1007,6 +1059,7 @@
             <w:pPr>
               <w:pStyle w:val="Normal"/>
               <w:widowControl/>
+              <w:suppressAutoHyphens w:val="true"/>
               <w:spacing w:lineRule="auto" w:line="240" w:before="0" w:after="0"/>
               <w:jc w:val="center"/>
               <w:rPr>
@@ -1039,6 +1092,7 @@
             <w:pPr>
               <w:pStyle w:val="Normal"/>
               <w:widowControl/>
+              <w:suppressAutoHyphens w:val="true"/>
               <w:spacing w:lineRule="auto" w:line="240" w:before="0" w:after="0"/>
               <w:jc w:val="start"/>
               <w:rPr>
@@ -1071,6 +1125,7 @@
             <w:pPr>
               <w:pStyle w:val="Normal"/>
               <w:widowControl/>
+              <w:suppressAutoHyphens w:val="true"/>
               <w:spacing w:lineRule="auto" w:line="240" w:before="0" w:after="0"/>
               <w:jc w:val="start"/>
               <w:rPr>
@@ -1105,6 +1160,7 @@
             <w:pPr>
               <w:pStyle w:val="Normal"/>
               <w:widowControl/>
+              <w:suppressAutoHyphens w:val="true"/>
               <w:spacing w:lineRule="auto" w:line="240" w:before="0" w:after="0"/>
               <w:jc w:val="center"/>
               <w:rPr>
@@ -1136,6 +1192,7 @@
             <w:pPr>
               <w:pStyle w:val="Normal"/>
               <w:widowControl/>
+              <w:suppressAutoHyphens w:val="true"/>
               <w:spacing w:lineRule="auto" w:line="240" w:before="0" w:after="0"/>
               <w:jc w:val="start"/>
               <w:rPr>
@@ -1167,6 +1224,7 @@
             <w:pPr>
               <w:pStyle w:val="Normal"/>
               <w:widowControl/>
+              <w:suppressAutoHyphens w:val="true"/>
               <w:spacing w:lineRule="auto" w:line="240" w:before="0" w:after="0"/>
               <w:jc w:val="start"/>
               <w:rPr>
@@ -1202,6 +1260,7 @@
             <w:pPr>
               <w:pStyle w:val="Normal"/>
               <w:widowControl/>
+              <w:suppressAutoHyphens w:val="true"/>
               <w:spacing w:lineRule="auto" w:line="240" w:before="0" w:after="0"/>
               <w:jc w:val="center"/>
               <w:rPr>
@@ -1234,6 +1293,7 @@
             <w:pPr>
               <w:pStyle w:val="Normal"/>
               <w:widowControl/>
+              <w:suppressAutoHyphens w:val="true"/>
               <w:spacing w:lineRule="auto" w:line="240" w:before="0" w:after="0"/>
               <w:jc w:val="start"/>
               <w:rPr>
@@ -1266,6 +1326,7 @@
             <w:pPr>
               <w:pStyle w:val="Normal"/>
               <w:widowControl/>
+              <w:suppressAutoHyphens w:val="true"/>
               <w:spacing w:lineRule="auto" w:line="240" w:before="0" w:after="0"/>
               <w:jc w:val="start"/>
               <w:rPr>
@@ -1364,6 +1425,7 @@
             <w:pPr>
               <w:pStyle w:val="Normal"/>
               <w:widowControl/>
+              <w:suppressAutoHyphens w:val="true"/>
               <w:spacing w:lineRule="auto" w:line="240" w:before="0" w:after="0"/>
               <w:jc w:val="center"/>
               <w:rPr>
@@ -1397,6 +1459,7 @@
             <w:pPr>
               <w:pStyle w:val="Normal"/>
               <w:widowControl/>
+              <w:suppressAutoHyphens w:val="true"/>
               <w:spacing w:lineRule="auto" w:line="240" w:before="0" w:after="0"/>
               <w:jc w:val="center"/>
               <w:rPr>
@@ -1432,6 +1495,7 @@
             <w:pPr>
               <w:pStyle w:val="Normal"/>
               <w:widowControl/>
+              <w:suppressAutoHyphens w:val="true"/>
               <w:spacing w:lineRule="auto" w:line="240" w:before="0" w:after="0"/>
               <w:jc w:val="start"/>
               <w:rPr>
@@ -1463,6 +1527,7 @@
             <w:pPr>
               <w:pStyle w:val="Normal"/>
               <w:widowControl/>
+              <w:suppressAutoHyphens w:val="true"/>
               <w:spacing w:lineRule="auto" w:line="240" w:before="0" w:after="0"/>
               <w:jc w:val="start"/>
               <w:rPr>
@@ -1497,6 +1562,7 @@
             <w:pPr>
               <w:pStyle w:val="Normal"/>
               <w:widowControl/>
+              <w:suppressAutoHyphens w:val="true"/>
               <w:spacing w:lineRule="auto" w:line="240" w:before="0" w:after="0"/>
               <w:jc w:val="start"/>
               <w:rPr>
@@ -1528,6 +1594,7 @@
             <w:pPr>
               <w:pStyle w:val="Normal"/>
               <w:widowControl/>
+              <w:suppressAutoHyphens w:val="true"/>
               <w:spacing w:lineRule="auto" w:line="240" w:before="0" w:after="0"/>
               <w:jc w:val="start"/>
               <w:rPr>
@@ -1562,6 +1629,7 @@
             <w:pPr>
               <w:pStyle w:val="Normal"/>
               <w:widowControl/>
+              <w:suppressAutoHyphens w:val="true"/>
               <w:spacing w:lineRule="auto" w:line="240" w:before="0" w:after="0"/>
               <w:jc w:val="start"/>
               <w:rPr>
@@ -1593,6 +1661,7 @@
             <w:pPr>
               <w:pStyle w:val="Normal"/>
               <w:widowControl/>
+              <w:suppressAutoHyphens w:val="true"/>
               <w:spacing w:lineRule="auto" w:line="240" w:before="0" w:after="0"/>
               <w:jc w:val="start"/>
               <w:rPr>
@@ -1627,6 +1696,7 @@
             <w:pPr>
               <w:pStyle w:val="Normal"/>
               <w:widowControl/>
+              <w:suppressAutoHyphens w:val="true"/>
               <w:spacing w:lineRule="auto" w:line="240" w:before="0" w:after="0"/>
               <w:jc w:val="start"/>
               <w:rPr>
@@ -1658,6 +1728,7 @@
             <w:pPr>
               <w:pStyle w:val="Normal"/>
               <w:widowControl/>
+              <w:suppressAutoHyphens w:val="true"/>
               <w:spacing w:lineRule="auto" w:line="240" w:before="0" w:after="0"/>
               <w:jc w:val="start"/>
               <w:rPr>
@@ -1692,6 +1763,7 @@
             <w:pPr>
               <w:pStyle w:val="Normal"/>
               <w:widowControl/>
+              <w:suppressAutoHyphens w:val="true"/>
               <w:spacing w:lineRule="auto" w:line="240" w:before="0" w:after="0"/>
               <w:jc w:val="start"/>
               <w:rPr>
@@ -1723,6 +1795,7 @@
             <w:pPr>
               <w:pStyle w:val="Normal"/>
               <w:widowControl/>
+              <w:suppressAutoHyphens w:val="true"/>
               <w:spacing w:lineRule="auto" w:line="240" w:before="0" w:after="0"/>
               <w:jc w:val="start"/>
               <w:rPr>
@@ -1797,6 +1870,7 @@
             <w:pPr>
               <w:pStyle w:val="Normal"/>
               <w:widowControl/>
+              <w:suppressAutoHyphens w:val="true"/>
               <w:spacing w:lineRule="auto" w:line="240" w:before="0" w:after="0"/>
               <w:jc w:val="start"/>
               <w:rPr>
@@ -1831,6 +1905,7 @@
             <w:pPr>
               <w:pStyle w:val="Normal"/>
               <w:widowControl/>
+              <w:suppressAutoHyphens w:val="true"/>
               <w:spacing w:lineRule="auto" w:line="240" w:before="0" w:after="0"/>
               <w:jc w:val="start"/>
               <w:rPr>
@@ -1866,6 +1941,7 @@
             <w:pPr>
               <w:pStyle w:val="Normal"/>
               <w:widowControl/>
+              <w:suppressAutoHyphens w:val="true"/>
               <w:spacing w:lineRule="auto" w:line="240" w:before="0" w:after="0"/>
               <w:jc w:val="start"/>
               <w:rPr>
@@ -1900,6 +1976,7 @@
             <w:pPr>
               <w:pStyle w:val="Normal"/>
               <w:widowControl/>
+              <w:suppressAutoHyphens w:val="true"/>
               <w:spacing w:lineRule="auto" w:line="240" w:before="0" w:after="0"/>
               <w:jc w:val="start"/>
               <w:rPr>
@@ -2543,26 +2620,6 @@
         <w:rPr>
           <w:b/>
         </w:rPr>
-        <w:t xml:space="preserve">Maker/checker approval: </w:t>
-      </w:r>
-      <w:r>
-        <w:rPr/>
-        <w:t>Add a second-approver workflow before a submitted movement becomes final, so the person who initiates a transaction is never also the person who approves it.</w:t>
-      </w:r>
-    </w:p>
-    <w:p>
-      <w:pPr>
-        <w:pStyle w:val="ListNumber"/>
-        <w:numPr>
-          <w:ilvl w:val="0"/>
-          <w:numId w:val="4"/>
-        </w:numPr>
-        <w:rPr/>
-      </w:pPr>
-      <w:r>
-        <w:rPr>
-          <w:b/>
-        </w:rPr>
         <w:t xml:space="preserve">Secret management: </w:t>
       </w:r>
       <w:r>
@@ -2583,11 +2640,10 @@
         <w:rPr>
           <w:b/>
         </w:rPr>
-        <w:t xml:space="preserve">Currency normalisation: </w:t>
+        <w:t>Field-conflict auditing: a genuine idempotency-key conflict (same reference, different Amount/Currency/OccurredAt) is now both reported to the caller as ALREADY_EXISTS and persisted to a MovementConflictAudits table with a Warning log line, per §9 below — previously only the caller-facing error existed.</w:t>
       </w:r>
       <w:r>
         <w:rPr/>
-        <w:t>Currency codes are validated as three letters but not case-normalised — "zar" and "ZAR" are currently accepted as distinct values. Flagged as a known gap rather than silently patched.</w:t>
       </w:r>
     </w:p>
     <w:p>
@@ -2673,15 +2729,6 @@
     <w:p>
       <w:pPr>
         <w:pStyle w:val="Normal"/>
-        <w:rPr/>
-      </w:pPr>
-      <w:r>
-        <w:rPr/>
-      </w:r>
-    </w:p>
-    <w:p>
-      <w:pPr>
-        <w:pStyle w:val="Normal"/>
         <w:widowControl/>
         <w:bidi w:val="0"/>
         <w:spacing w:lineRule="auto" w:line="276" w:before="0" w:after="200"/>
@@ -2691,6 +2738,423 @@
       <w:r>
         <w:rPr/>
         <w:t>For the full technical rationale behind every design decision summarised in this manual, see docs/SOLUTION.md in the repository.</w:t>
+      </w:r>
+    </w:p>
+    <w:p>
+      <w:pPr>
+        <w:pStyle w:val="Heading1"/>
+      </w:pPr>
+      <w:r>
+        <w:t>9. Audit Procedure for Duplicate Conflicts</w:t>
+      </w:r>
+    </w:p>
+    <w:p>
+      <w:r>
+        <w:t>Non-technical summary: if someone accidentally submits the same movement twice with different numbers (for example, a retry with a typo'd amount), the system doesn't just reject it quietly — it records exactly what happened so it can be investigated later.</w:t>
+      </w:r>
+    </w:p>
+    <w:p>
+      <w:r>
+        <w:t>A duplicate submission that matches the stored movement exactly is a safe retry and is not audited — it is simply returned as success. A duplicate that differs in Amount, Currency or OccurredAt is a genuine conflict, and MovementRepository.AuditConflictAsync does two things when that happens, alongside returning ALREADY_EXISTS to the caller:</w:t>
+      </w:r>
+    </w:p>
+    <w:p>
+      <w:pPr>
+        <w:pStyle w:val="ListBullet"/>
+      </w:pPr>
+      <w:r>
+        <w:t>Logs a Warning via Serilog naming the account, external reference, and which fields conflicted.</w:t>
+      </w:r>
+    </w:p>
+    <w:p>
+      <w:pPr>
+        <w:pStyle w:val="ListBullet"/>
+      </w:pPr>
+      <w:r>
+        <w:t>Writes a row to the MovementConflictAudits table recording the attempted values, the stored values, which fields differed, and when the conflict was detected.</w:t>
+      </w:r>
+    </w:p>
+    <w:p>
+      <w:r>
+        <w:t>The audit write is best-effort: a failure to write the audit row is itself logged as an Error, but never turns an already-handled conflict into an unhandled exception for the caller — the caller's ALREADY_EXISTS response is not put at risk by the audit trail failing.</w:t>
+      </w:r>
+    </w:p>
+    <w:p>
+      <w:pPr>
+        <w:pStyle w:val="Heading1"/>
+      </w:pPr>
+      <w:r>
+        <w:t>10. Observability</w:t>
+      </w:r>
+    </w:p>
+    <w:p>
+      <w:r>
+        <w:t>Non-technical summary: every request the system handles leaves a trail — a structured log entry and a distributed trace — so a problem in production can be diagnosed from evidence rather than guesswork.</w:t>
+      </w:r>
+    </w:p>
+    <w:p>
+      <w:pPr>
+        <w:pStyle w:val="Heading2"/>
+      </w:pPr>
+      <w:r>
+        <w:t>10.1 Structured logging (Seq)</w:t>
+      </w:r>
+    </w:p>
+    <w:p>
+      <w:r>
+        <w:t>Serilog writes structured log events to Seq. Every MediatR command/query is logged on entry and exit with duration (LoggingBehaviour), and unhandled exceptions are logged with full detail server-side before being converted to a status-only gRPC error on the wire (ErrorInterceptor) — nothing sensitive ever reaches the client.</w:t>
+      </w:r>
+    </w:p>
+    <w:p>
+      <w:pPr>
+        <w:jc w:val="center"/>
+      </w:pPr>
+      <w:r>
+        <w:drawing>
+          <wp:inline xmlns:a="http://schemas.openxmlformats.org/drawingml/2006/main">
+            <wp:extent cx="5760720" cy="3060382"/>
+            <wp:docPr id="3" name="Picture 3"/>
+            <wp:cNvGraphicFramePr>
+              <a:graphicFrameLocks noChangeAspect="1"/>
+            </wp:cNvGraphicFramePr>
+            <a:graphic>
+              <a:graphicData uri="http://schemas.openxmlformats.org/drawingml/2006/picture">
+                <pic:pic>
+                  <pic:nvPicPr>
+                    <pic:cNvPr id="0" name="seq-structured-logs.png"/>
+                    <pic:cNvPicPr/>
+                  </pic:nvPicPr>
+                  <pic:blipFill>
+                    <a:blip r:embed="rId9"/>
+                    <a:stretch>
+                      <a:fillRect/>
+                    </a:stretch>
+                  </pic:blipFill>
+                  <pic:spPr>
+                    <a:xfrm>
+                      <a:off x="0" y="0"/>
+                      <a:ext cx="5760720" cy="3060382"/>
+                    </a:xfrm>
+                    <a:prstGeom prst="rect"/>
+                  </pic:spPr>
+                </pic:pic>
+              </a:graphicData>
+            </a:graphic>
+          </wp:inline>
+        </w:drawing>
+      </w:r>
+    </w:p>
+    <w:p>
+      <w:pPr>
+        <w:jc w:val="center"/>
+      </w:pPr>
+      <w:r>
+        <w:rPr>
+          <w:i/>
+        </w:rPr>
+        <w:t>Seq: structured request/response and error logs from a live run.</w:t>
+      </w:r>
+    </w:p>
+    <w:p>
+      <w:pPr>
+        <w:pStyle w:val="Heading2"/>
+      </w:pPr>
+      <w:r>
+        <w:t>10.2 Distributed tracing (Jaeger)</w:t>
+      </w:r>
+    </w:p>
+    <w:p>
+      <w:r>
+        <w:t>OpenTelemetry exports traces via OTLP to Jaeger, instrumented at the ASP.NET Core level so every gRPC call becomes a span without any manual instrumentation in handler code.</w:t>
+      </w:r>
+    </w:p>
+    <w:p>
+      <w:pPr>
+        <w:jc w:val="center"/>
+      </w:pPr>
+      <w:r>
+        <w:drawing>
+          <wp:inline xmlns:a="http://schemas.openxmlformats.org/drawingml/2006/main">
+            <wp:extent cx="5760720" cy="3060382"/>
+            <wp:docPr id="4" name="Picture 4"/>
+            <wp:cNvGraphicFramePr>
+              <a:graphicFrameLocks noChangeAspect="1"/>
+            </wp:cNvGraphicFramePr>
+            <a:graphic>
+              <a:graphicData uri="http://schemas.openxmlformats.org/drawingml/2006/picture">
+                <pic:pic>
+                  <pic:nvPicPr>
+                    <pic:cNvPr id="0" name="jaeger-traces-list.png"/>
+                    <pic:cNvPicPr/>
+                  </pic:nvPicPr>
+                  <pic:blipFill>
+                    <a:blip r:embed="rId10"/>
+                    <a:stretch>
+                      <a:fillRect/>
+                    </a:stretch>
+                  </pic:blipFill>
+                  <pic:spPr>
+                    <a:xfrm>
+                      <a:off x="0" y="0"/>
+                      <a:ext cx="5760720" cy="3060382"/>
+                    </a:xfrm>
+                    <a:prstGeom prst="rect"/>
+                  </pic:spPr>
+                </pic:pic>
+              </a:graphicData>
+            </a:graphic>
+          </wp:inline>
+        </w:drawing>
+      </w:r>
+    </w:p>
+    <w:p>
+      <w:pPr>
+        <w:jc w:val="center"/>
+      </w:pPr>
+      <w:r>
+        <w:rPr>
+          <w:i/>
+        </w:rPr>
+        <w:t>Jaeger: recent traces for Sygnia.Presentation, including ListAccounts and GetBalance.</w:t>
+      </w:r>
+    </w:p>
+    <w:p>
+      <w:pPr>
+        <w:jc w:val="center"/>
+      </w:pPr>
+      <w:r>
+        <w:drawing>
+          <wp:inline xmlns:a="http://schemas.openxmlformats.org/drawingml/2006/main">
+            <wp:extent cx="5760720" cy="3060382"/>
+            <wp:docPr id="5" name="Picture 5"/>
+            <wp:cNvGraphicFramePr>
+              <a:graphicFrameLocks noChangeAspect="1"/>
+            </wp:cNvGraphicFramePr>
+            <a:graphic>
+              <a:graphicData uri="http://schemas.openxmlformats.org/drawingml/2006/picture">
+                <pic:pic>
+                  <pic:nvPicPr>
+                    <pic:cNvPr id="0" name="jaeger-trace-detail.png"/>
+                    <pic:cNvPicPr/>
+                  </pic:nvPicPr>
+                  <pic:blipFill>
+                    <a:blip r:embed="rId11"/>
+                    <a:stretch>
+                      <a:fillRect/>
+                    </a:stretch>
+                  </pic:blipFill>
+                  <pic:spPr>
+                    <a:xfrm>
+                      <a:off x="0" y="0"/>
+                      <a:ext cx="5760720" cy="3060382"/>
+                    </a:xfrm>
+                    <a:prstGeom prst="rect"/>
+                  </pic:spPr>
+                </pic:pic>
+              </a:graphicData>
+            </a:graphic>
+          </wp:inline>
+        </w:drawing>
+      </w:r>
+    </w:p>
+    <w:p>
+      <w:pPr>
+        <w:jc w:val="center"/>
+      </w:pPr>
+      <w:r>
+        <w:rPr>
+          <w:i/>
+        </w:rPr>
+        <w:t>Jaeger: trace detail/waterfall view for a single ListAccounts request.</w:t>
+      </w:r>
+    </w:p>
+    <w:p>
+      <w:pPr>
+        <w:pStyle w:val="Heading1"/>
+      </w:pPr>
+      <w:r>
+        <w:t>11. Testing Evidence</w:t>
+      </w:r>
+    </w:p>
+    <w:p>
+      <w:r>
+        <w:t>Non-technical summary: beyond the automated test suite, the gRPC API was exercised directly with a real client, and every change is verified by an automated build before it can be merged.</w:t>
+      </w:r>
+    </w:p>
+    <w:p>
+      <w:pPr>
+        <w:pStyle w:val="Heading2"/>
+      </w:pPr>
+      <w:r>
+        <w:t>11.1 gRPC verified via Postman</w:t>
+      </w:r>
+    </w:p>
+    <w:p>
+      <w:r>
+        <w:t>Swagger/OpenAPI doesn't apply to a binary gRPC service, so Postman's native gRPC client was used instead, with server reflection enabled (development environment only) so Postman can discover the service and its methods without a manual .proto import. MovementService/GetBalance was invoked against a seeded account:</w:t>
+      </w:r>
+    </w:p>
+    <w:p>
+      <w:pPr>
+        <w:jc w:val="center"/>
+      </w:pPr>
+      <w:r>
+        <w:drawing>
+          <wp:inline xmlns:a="http://schemas.openxmlformats.org/drawingml/2006/main">
+            <wp:extent cx="5486400" cy="2914650"/>
+            <wp:docPr id="6" name="Picture 6"/>
+            <wp:cNvGraphicFramePr>
+              <a:graphicFrameLocks noChangeAspect="1"/>
+            </wp:cNvGraphicFramePr>
+            <a:graphic>
+              <a:graphicData uri="http://schemas.openxmlformats.org/drawingml/2006/picture">
+                <pic:pic>
+                  <pic:nvPicPr>
+                    <pic:cNvPr id="0" name="getbalance-response.png"/>
+                    <pic:cNvPicPr/>
+                  </pic:nvPicPr>
+                  <pic:blipFill>
+                    <a:blip r:embed="rId12"/>
+                    <a:stretch>
+                      <a:fillRect/>
+                    </a:stretch>
+                  </pic:blipFill>
+                  <pic:spPr>
+                    <a:xfrm>
+                      <a:off x="0" y="0"/>
+                      <a:ext cx="5486400" cy="2914650"/>
+                    </a:xfrm>
+                    <a:prstGeom prst="rect"/>
+                  </pic:spPr>
+                </pic:pic>
+              </a:graphicData>
+            </a:graphic>
+          </wp:inline>
+        </w:drawing>
+      </w:r>
+    </w:p>
+    <w:p>
+      <w:pPr>
+        <w:jc w:val="center"/>
+      </w:pPr>
+      <w:r>
+        <w:rPr>
+          <w:i/>
+        </w:rPr>
+        <w:t>Postman: MovementService/GetBalance invoked over TLS against localhost:7110, 0 OK.</w:t>
+      </w:r>
+    </w:p>
+    <w:p>
+      <w:pPr>
+        <w:pStyle w:val="Heading2"/>
+      </w:pPr>
+      <w:r>
+        <w:t>11.2 Continuous Integration (GitHub Actions)</w:t>
+      </w:r>
+    </w:p>
+    <w:p>
+      <w:r>
+        <w:t>Two workflows — Backend Build and Frontend Build — run on every push and pull request, so a change that doesn't compile or pass its test suite never reaches main unnoticed.</w:t>
+      </w:r>
+    </w:p>
+    <w:p>
+      <w:pPr>
+        <w:jc w:val="center"/>
+      </w:pPr>
+      <w:r>
+        <w:drawing>
+          <wp:inline xmlns:a="http://schemas.openxmlformats.org/drawingml/2006/main">
+            <wp:extent cx="5760720" cy="3060382"/>
+            <wp:docPr id="7" name="Picture 7"/>
+            <wp:cNvGraphicFramePr>
+              <a:graphicFrameLocks noChangeAspect="1"/>
+            </wp:cNvGraphicFramePr>
+            <a:graphic>
+              <a:graphicData uri="http://schemas.openxmlformats.org/drawingml/2006/picture">
+                <pic:pic>
+                  <pic:nvPicPr>
+                    <pic:cNvPr id="0" name="workflow-runs-history.png"/>
+                    <pic:cNvPicPr/>
+                  </pic:nvPicPr>
+                  <pic:blipFill>
+                    <a:blip r:embed="rId13"/>
+                    <a:stretch>
+                      <a:fillRect/>
+                    </a:stretch>
+                  </pic:blipFill>
+                  <pic:spPr>
+                    <a:xfrm>
+                      <a:off x="0" y="0"/>
+                      <a:ext cx="5760720" cy="3060382"/>
+                    </a:xfrm>
+                    <a:prstGeom prst="rect"/>
+                  </pic:spPr>
+                </pic:pic>
+              </a:graphicData>
+            </a:graphic>
+          </wp:inline>
+        </w:drawing>
+      </w:r>
+    </w:p>
+    <w:p>
+      <w:pPr>
+        <w:jc w:val="center"/>
+      </w:pPr>
+      <w:r>
+        <w:rPr>
+          <w:i/>
+        </w:rPr>
+        <w:t>GitHub Actions: Backend Build history — every merge and pull request triggers a build.</w:t>
+      </w:r>
+    </w:p>
+    <w:p>
+      <w:pPr>
+        <w:jc w:val="center"/>
+      </w:pPr>
+      <w:r>
+        <w:drawing>
+          <wp:inline xmlns:a="http://schemas.openxmlformats.org/drawingml/2006/main">
+            <wp:extent cx="5760720" cy="3060382"/>
+            <wp:docPr id="8" name="Picture 8"/>
+            <wp:cNvGraphicFramePr>
+              <a:graphicFrameLocks noChangeAspect="1"/>
+            </wp:cNvGraphicFramePr>
+            <a:graphic>
+              <a:graphicData uri="http://schemas.openxmlformats.org/drawingml/2006/picture">
+                <pic:pic>
+                  <pic:nvPicPr>
+                    <pic:cNvPr id="0" name="backend-build-run-detail.png"/>
+                    <pic:cNvPicPr/>
+                  </pic:nvPicPr>
+                  <pic:blipFill>
+                    <a:blip r:embed="rId14"/>
+                    <a:stretch>
+                      <a:fillRect/>
+                    </a:stretch>
+                  </pic:blipFill>
+                  <pic:spPr>
+                    <a:xfrm>
+                      <a:off x="0" y="0"/>
+                      <a:ext cx="5760720" cy="3060382"/>
+                    </a:xfrm>
+                    <a:prstGeom prst="rect"/>
+                  </pic:spPr>
+                </pic:pic>
+              </a:graphicData>
+            </a:graphic>
+          </wp:inline>
+        </w:drawing>
+      </w:r>
+    </w:p>
+    <w:p>
+      <w:pPr>
+        <w:jc w:val="center"/>
+      </w:pPr>
+      <w:r>
+        <w:rPr>
+          <w:i/>
+        </w:rPr>
+        <w:t>GitHub Actions: a Backend Build run's steps, all green.</w:t>
       </w:r>
     </w:p>
     <w:sectPr>
@@ -2735,6 +3199,7 @@
         </w:tabs>
         <w:ind w:start="1080" w:hanging="360"/>
       </w:pPr>
+      <w:rPr/>
     </w:lvl>
     <w:lvl w:ilvl="2">
       <w:start w:val="1"/>
@@ -2747,6 +3212,7 @@
         </w:tabs>
         <w:ind w:start="1440" w:hanging="360"/>
       </w:pPr>
+      <w:rPr/>
     </w:lvl>
     <w:lvl w:ilvl="3">
       <w:start w:val="1"/>
@@ -2759,6 +3225,7 @@
         </w:tabs>
         <w:ind w:start="1800" w:hanging="360"/>
       </w:pPr>
+      <w:rPr/>
     </w:lvl>
     <w:lvl w:ilvl="4">
       <w:start w:val="1"/>
@@ -2771,6 +3238,7 @@
         </w:tabs>
         <w:ind w:start="2160" w:hanging="360"/>
       </w:pPr>
+      <w:rPr/>
     </w:lvl>
     <w:lvl w:ilvl="5">
       <w:start w:val="1"/>
@@ -2783,6 +3251,7 @@
         </w:tabs>
         <w:ind w:start="2520" w:hanging="360"/>
       </w:pPr>
+      <w:rPr/>
     </w:lvl>
     <w:lvl w:ilvl="6">
       <w:start w:val="1"/>
@@ -2795,6 +3264,7 @@
         </w:tabs>
         <w:ind w:start="2880" w:hanging="360"/>
       </w:pPr>
+      <w:rPr/>
     </w:lvl>
     <w:lvl w:ilvl="7">
       <w:start w:val="1"/>
@@ -2807,6 +3277,7 @@
         </w:tabs>
         <w:ind w:start="3240" w:hanging="360"/>
       </w:pPr>
+      <w:rPr/>
     </w:lvl>
     <w:lvl w:ilvl="8">
       <w:start w:val="1"/>
@@ -2819,6 +3290,7 @@
         </w:tabs>
         <w:ind w:start="3600" w:hanging="360"/>
       </w:pPr>
+      <w:rPr/>
     </w:lvl>
   </w:abstractNum>
   <w:abstractNum w:abstractNumId="2">
@@ -2848,6 +3320,7 @@
         </w:tabs>
         <w:ind w:start="1080" w:hanging="360"/>
       </w:pPr>
+      <w:rPr/>
     </w:lvl>
     <w:lvl w:ilvl="2">
       <w:start w:val="1"/>
@@ -2860,6 +3333,7 @@
         </w:tabs>
         <w:ind w:start="1440" w:hanging="360"/>
       </w:pPr>
+      <w:rPr/>
     </w:lvl>
     <w:lvl w:ilvl="3">
       <w:start w:val="1"/>
@@ -2872,6 +3346,7 @@
         </w:tabs>
         <w:ind w:start="1800" w:hanging="360"/>
       </w:pPr>
+      <w:rPr/>
     </w:lvl>
     <w:lvl w:ilvl="4">
       <w:start w:val="1"/>
@@ -2884,6 +3359,7 @@
         </w:tabs>
         <w:ind w:start="2160" w:hanging="360"/>
       </w:pPr>
+      <w:rPr/>
     </w:lvl>
     <w:lvl w:ilvl="5">
       <w:start w:val="1"/>
@@ -2896,6 +3372,7 @@
         </w:tabs>
         <w:ind w:start="2520" w:hanging="360"/>
       </w:pPr>
+      <w:rPr/>
     </w:lvl>
     <w:lvl w:ilvl="6">
       <w:start w:val="1"/>
@@ -2908,6 +3385,7 @@
         </w:tabs>
         <w:ind w:start="2880" w:hanging="360"/>
       </w:pPr>
+      <w:rPr/>
     </w:lvl>
     <w:lvl w:ilvl="7">
       <w:start w:val="1"/>
@@ -2920,6 +3398,7 @@
         </w:tabs>
         <w:ind w:start="3240" w:hanging="360"/>
       </w:pPr>
+      <w:rPr/>
     </w:lvl>
     <w:lvl w:ilvl="8">
       <w:start w:val="1"/>
@@ -2932,6 +3411,7 @@
         </w:tabs>
         <w:ind w:start="3600" w:hanging="360"/>
       </w:pPr>
+      <w:rPr/>
     </w:lvl>
   </w:abstractNum>
   <w:abstractNum w:abstractNumId="3">
@@ -2961,6 +3441,7 @@
         </w:tabs>
         <w:ind w:start="1080" w:hanging="360"/>
       </w:pPr>
+      <w:rPr/>
     </w:lvl>
     <w:lvl w:ilvl="2">
       <w:start w:val="1"/>
@@ -2973,6 +3454,7 @@
         </w:tabs>
         <w:ind w:start="1440" w:hanging="360"/>
       </w:pPr>
+      <w:rPr/>
     </w:lvl>
     <w:lvl w:ilvl="3">
       <w:start w:val="1"/>
@@ -2985,6 +3467,7 @@
         </w:tabs>
         <w:ind w:start="1800" w:hanging="360"/>
       </w:pPr>
+      <w:rPr/>
     </w:lvl>
     <w:lvl w:ilvl="4">
       <w:start w:val="1"/>
@@ -2997,6 +3480,7 @@
         </w:tabs>
         <w:ind w:start="2160" w:hanging="360"/>
       </w:pPr>
+      <w:rPr/>
     </w:lvl>
     <w:lvl w:ilvl="5">
       <w:start w:val="1"/>
@@ -3009,6 +3493,7 @@
         </w:tabs>
         <w:ind w:start="2520" w:hanging="360"/>
       </w:pPr>
+      <w:rPr/>
     </w:lvl>
     <w:lvl w:ilvl="6">
       <w:start w:val="1"/>
@@ -3021,6 +3506,7 @@
         </w:tabs>
         <w:ind w:start="2880" w:hanging="360"/>
       </w:pPr>
+      <w:rPr/>
     </w:lvl>
     <w:lvl w:ilvl="7">
       <w:start w:val="1"/>
@@ -3033,6 +3519,7 @@
         </w:tabs>
         <w:ind w:start="3240" w:hanging="360"/>
       </w:pPr>
+      <w:rPr/>
     </w:lvl>
     <w:lvl w:ilvl="8">
       <w:start w:val="1"/>
@@ -3045,6 +3532,7 @@
         </w:tabs>
         <w:ind w:start="3600" w:hanging="360"/>
       </w:pPr>
+      <w:rPr/>
     </w:lvl>
   </w:abstractNum>
   <w:abstractNum w:abstractNumId="4">
@@ -3072,6 +3560,7 @@
         </w:tabs>
         <w:ind w:start="1080" w:hanging="360"/>
       </w:pPr>
+      <w:rPr/>
     </w:lvl>
     <w:lvl w:ilvl="2">
       <w:start w:val="1"/>
@@ -3084,6 +3573,7 @@
         </w:tabs>
         <w:ind w:start="1440" w:hanging="360"/>
       </w:pPr>
+      <w:rPr/>
     </w:lvl>
     <w:lvl w:ilvl="3">
       <w:start w:val="1"/>
@@ -3096,6 +3586,7 @@
         </w:tabs>
         <w:ind w:start="1800" w:hanging="360"/>
       </w:pPr>
+      <w:rPr/>
     </w:lvl>
     <w:lvl w:ilvl="4">
       <w:start w:val="1"/>
@@ -3108,6 +3599,7 @@
         </w:tabs>
         <w:ind w:start="2160" w:hanging="360"/>
       </w:pPr>
+      <w:rPr/>
     </w:lvl>
     <w:lvl w:ilvl="5">
       <w:start w:val="1"/>
@@ -3120,6 +3612,7 @@
         </w:tabs>
         <w:ind w:start="2520" w:hanging="360"/>
       </w:pPr>
+      <w:rPr/>
     </w:lvl>
     <w:lvl w:ilvl="6">
       <w:start w:val="1"/>
@@ -3132,6 +3625,7 @@
         </w:tabs>
         <w:ind w:start="2880" w:hanging="360"/>
       </w:pPr>
+      <w:rPr/>
     </w:lvl>
     <w:lvl w:ilvl="7">
       <w:start w:val="1"/>
@@ -3144,6 +3638,7 @@
         </w:tabs>
         <w:ind w:start="3240" w:hanging="360"/>
       </w:pPr>
+      <w:rPr/>
     </w:lvl>
     <w:lvl w:ilvl="8">
       <w:start w:val="1"/>
@@ -3156,6 +3651,7 @@
         </w:tabs>
         <w:ind w:start="3600" w:hanging="360"/>
       </w:pPr>
+      <w:rPr/>
     </w:lvl>
   </w:abstractNum>
   <w:abstractNum w:abstractNumId="5">
@@ -3183,6 +3679,7 @@
         </w:tabs>
         <w:ind w:start="1080" w:hanging="360"/>
       </w:pPr>
+      <w:rPr/>
     </w:lvl>
     <w:lvl w:ilvl="2">
       <w:start w:val="1"/>
@@ -3195,6 +3692,7 @@
         </w:tabs>
         <w:ind w:start="1440" w:hanging="360"/>
       </w:pPr>
+      <w:rPr/>
     </w:lvl>
     <w:lvl w:ilvl="3">
       <w:start w:val="1"/>
@@ -3207,6 +3705,7 @@
         </w:tabs>
         <w:ind w:start="1800" w:hanging="360"/>
       </w:pPr>
+      <w:rPr/>
     </w:lvl>
     <w:lvl w:ilvl="4">
       <w:start w:val="1"/>
@@ -3219,6 +3718,7 @@
         </w:tabs>
         <w:ind w:start="2160" w:hanging="360"/>
       </w:pPr>
+      <w:rPr/>
     </w:lvl>
     <w:lvl w:ilvl="5">
       <w:start w:val="1"/>
@@ -3231,6 +3731,7 @@
         </w:tabs>
         <w:ind w:start="2520" w:hanging="360"/>
       </w:pPr>
+      <w:rPr/>
     </w:lvl>
     <w:lvl w:ilvl="6">
       <w:start w:val="1"/>
@@ -3243,6 +3744,7 @@
         </w:tabs>
         <w:ind w:start="2880" w:hanging="360"/>
       </w:pPr>
+      <w:rPr/>
     </w:lvl>
     <w:lvl w:ilvl="7">
       <w:start w:val="1"/>
@@ -3255,6 +3757,7 @@
         </w:tabs>
         <w:ind w:start="3240" w:hanging="360"/>
       </w:pPr>
+      <w:rPr/>
     </w:lvl>
     <w:lvl w:ilvl="8">
       <w:start w:val="1"/>
@@ -3267,6 +3770,7 @@
         </w:tabs>
         <w:ind w:start="3600" w:hanging="360"/>
       </w:pPr>
+      <w:rPr/>
     </w:lvl>
   </w:abstractNum>
   <w:abstractNum w:abstractNumId="6">
@@ -3294,6 +3798,7 @@
         </w:tabs>
         <w:ind w:start="1080" w:hanging="360"/>
       </w:pPr>
+      <w:rPr/>
     </w:lvl>
     <w:lvl w:ilvl="2">
       <w:start w:val="1"/>
@@ -3306,6 +3811,7 @@
         </w:tabs>
         <w:ind w:start="1440" w:hanging="360"/>
       </w:pPr>
+      <w:rPr/>
     </w:lvl>
     <w:lvl w:ilvl="3">
       <w:start w:val="1"/>
@@ -3318,6 +3824,7 @@
         </w:tabs>
         <w:ind w:start="1800" w:hanging="360"/>
       </w:pPr>
+      <w:rPr/>
     </w:lvl>
     <w:lvl w:ilvl="4">
       <w:start w:val="1"/>
@@ -3330,6 +3837,7 @@
         </w:tabs>
         <w:ind w:start="2160" w:hanging="360"/>
       </w:pPr>
+      <w:rPr/>
     </w:lvl>
     <w:lvl w:ilvl="5">
       <w:start w:val="1"/>
@@ -3342,6 +3850,7 @@
         </w:tabs>
         <w:ind w:start="2520" w:hanging="360"/>
       </w:pPr>
+      <w:rPr/>
     </w:lvl>
     <w:lvl w:ilvl="6">
       <w:start w:val="1"/>
@@ -3354,6 +3863,7 @@
         </w:tabs>
         <w:ind w:start="2880" w:hanging="360"/>
       </w:pPr>
+      <w:rPr/>
     </w:lvl>
     <w:lvl w:ilvl="7">
       <w:start w:val="1"/>
@@ -3366,6 +3876,7 @@
         </w:tabs>
         <w:ind w:start="3240" w:hanging="360"/>
       </w:pPr>
+      <w:rPr/>
     </w:lvl>
     <w:lvl w:ilvl="8">
       <w:start w:val="1"/>
@@ -3378,6 +3889,7 @@
         </w:tabs>
         <w:ind w:start="3600" w:hanging="360"/>
       </w:pPr>
+      <w:rPr/>
     </w:lvl>
   </w:abstractNum>
   <w:abstractNum w:abstractNumId="7">
@@ -3528,7 +4040,7 @@
   <w:docDefaults>
     <w:rPrDefault>
       <w:rPr>
-        <w:rFonts w:ascii="Cambria" w:hAnsi="Cambria" w:eastAsia="ＭＳ 明朝" w:cs="" w:asciiTheme="minorHAnsi" w:cstheme="minorBidi" w:eastAsiaTheme="minorEastAsia" w:hAnsiTheme="minorHAnsi"/>
+        <w:rFonts w:ascii="Cambria" w:hAnsi="Cambria" w:eastAsia="" w:cs="" w:asciiTheme="minorHAnsi" w:cstheme="minorBidi" w:eastAsiaTheme="minorEastAsia" w:hAnsiTheme="minorHAnsi"/>
         <w:sz w:val="22"/>
         <w:szCs w:val="22"/>
         <w:lang w:val="en-US" w:eastAsia="en-US" w:bidi="ar-SA"/>
@@ -3685,12 +4197,13 @@
     <w:rsid w:val="00fc693f"/>
     <w:pPr>
       <w:widowControl/>
+      <w:suppressAutoHyphens w:val="true"/>
       <w:bidi w:val="0"/>
       <w:spacing w:lineRule="auto" w:line="276" w:before="0" w:after="200"/>
       <w:jc w:val="start"/>
     </w:pPr>
     <w:rPr>
-      <w:rFonts w:ascii="Calibri" w:hAnsi="Calibri" w:eastAsia="ＭＳ 明朝" w:cs="" w:cstheme="minorBidi" w:eastAsiaTheme="minorEastAsia"/>
+      <w:rFonts w:ascii="Calibri" w:hAnsi="Calibri" w:eastAsia="" w:cs="" w:cstheme="minorBidi" w:eastAsiaTheme="minorEastAsia"/>
       <w:color w:val="auto"/>
       <w:kern w:val="0"/>
       <w:sz w:val="22"/>
@@ -3713,7 +4226,7 @@
       <w:outlineLvl w:val="0"/>
     </w:pPr>
     <w:rPr>
-      <w:rFonts w:ascii="Calibri" w:hAnsi="Calibri" w:eastAsia="ＭＳ ゴシック" w:cs="" w:asciiTheme="majorHAnsi" w:cstheme="majorBidi" w:eastAsiaTheme="majorEastAsia" w:hAnsiTheme="majorHAnsi"/>
+      <w:rFonts w:ascii="Calibri" w:hAnsi="Calibri" w:eastAsia="" w:cs="" w:asciiTheme="majorHAnsi" w:cstheme="majorBidi" w:eastAsiaTheme="majorEastAsia" w:hAnsiTheme="majorHAnsi"/>
       <w:b/>
       <w:bCs/>
       <w:color w:themeColor="accent1" w:themeShade="bf" w:val="365F91"/>
@@ -3737,7 +4250,7 @@
       <w:outlineLvl w:val="1"/>
     </w:pPr>
     <w:rPr>
-      <w:rFonts w:ascii="Calibri" w:hAnsi="Calibri" w:eastAsia="ＭＳ ゴシック" w:cs="" w:asciiTheme="majorHAnsi" w:cstheme="majorBidi" w:eastAsiaTheme="majorEastAsia" w:hAnsiTheme="majorHAnsi"/>
+      <w:rFonts w:ascii="Calibri" w:hAnsi="Calibri" w:eastAsia="" w:cs="" w:asciiTheme="majorHAnsi" w:cstheme="majorBidi" w:eastAsiaTheme="majorEastAsia" w:hAnsiTheme="majorHAnsi"/>
       <w:b/>
       <w:bCs/>
       <w:color w:themeColor="accent1" w:val="4F81BD"/>
@@ -3761,7 +4274,7 @@
       <w:outlineLvl w:val="2"/>
     </w:pPr>
     <w:rPr>
-      <w:rFonts w:ascii="Calibri" w:hAnsi="Calibri" w:eastAsia="ＭＳ ゴシック" w:cs="" w:asciiTheme="majorHAnsi" w:cstheme="majorBidi" w:eastAsiaTheme="majorEastAsia" w:hAnsiTheme="majorHAnsi"/>
+      <w:rFonts w:ascii="Calibri" w:hAnsi="Calibri" w:eastAsia="" w:cs="" w:asciiTheme="majorHAnsi" w:cstheme="majorBidi" w:eastAsiaTheme="majorEastAsia" w:hAnsiTheme="majorHAnsi"/>
       <w:b/>
       <w:bCs/>
       <w:color w:themeColor="accent1" w:val="4F81BD"/>
@@ -3784,7 +4297,7 @@
       <w:outlineLvl w:val="3"/>
     </w:pPr>
     <w:rPr>
-      <w:rFonts w:ascii="Calibri" w:hAnsi="Calibri" w:eastAsia="ＭＳ ゴシック" w:cs="" w:asciiTheme="majorHAnsi" w:cstheme="majorBidi" w:eastAsiaTheme="majorEastAsia" w:hAnsiTheme="majorHAnsi"/>
+      <w:rFonts w:ascii="Calibri" w:hAnsi="Calibri" w:eastAsia="" w:cs="" w:asciiTheme="majorHAnsi" w:cstheme="majorBidi" w:eastAsiaTheme="majorEastAsia" w:hAnsiTheme="majorHAnsi"/>
       <w:b/>
       <w:bCs/>
       <w:i/>
@@ -3809,7 +4322,7 @@
       <w:outlineLvl w:val="4"/>
     </w:pPr>
     <w:rPr>
-      <w:rFonts w:ascii="Calibri" w:hAnsi="Calibri" w:eastAsia="ＭＳ ゴシック" w:cs="" w:asciiTheme="majorHAnsi" w:cstheme="majorBidi" w:eastAsiaTheme="majorEastAsia" w:hAnsiTheme="majorHAnsi"/>
+      <w:rFonts w:ascii="Calibri" w:hAnsi="Calibri" w:eastAsia="" w:cs="" w:asciiTheme="majorHAnsi" w:cstheme="majorBidi" w:eastAsiaTheme="majorEastAsia" w:hAnsiTheme="majorHAnsi"/>
       <w:color w:themeColor="accent1" w:themeShade="7f" w:val="243F60"/>
     </w:rPr>
   </w:style>
@@ -3830,7 +4343,7 @@
       <w:outlineLvl w:val="5"/>
     </w:pPr>
     <w:rPr>
-      <w:rFonts w:ascii="Calibri" w:hAnsi="Calibri" w:eastAsia="ＭＳ ゴシック" w:cs="" w:asciiTheme="majorHAnsi" w:cstheme="majorBidi" w:eastAsiaTheme="majorEastAsia" w:hAnsiTheme="majorHAnsi"/>
+      <w:rFonts w:ascii="Calibri" w:hAnsi="Calibri" w:eastAsia="" w:cs="" w:asciiTheme="majorHAnsi" w:cstheme="majorBidi" w:eastAsiaTheme="majorEastAsia" w:hAnsiTheme="majorHAnsi"/>
       <w:i/>
       <w:iCs/>
       <w:color w:themeColor="accent1" w:themeShade="7f" w:val="243F60"/>
@@ -3853,7 +4366,7 @@
       <w:outlineLvl w:val="6"/>
     </w:pPr>
     <w:rPr>
-      <w:rFonts w:ascii="Calibri" w:hAnsi="Calibri" w:eastAsia="ＭＳ ゴシック" w:cs="" w:asciiTheme="majorHAnsi" w:cstheme="majorBidi" w:eastAsiaTheme="majorEastAsia" w:hAnsiTheme="majorHAnsi"/>
+      <w:rFonts w:ascii="Calibri" w:hAnsi="Calibri" w:eastAsia="" w:cs="" w:asciiTheme="majorHAnsi" w:cstheme="majorBidi" w:eastAsiaTheme="majorEastAsia" w:hAnsiTheme="majorHAnsi"/>
       <w:i/>
       <w:iCs/>
       <w:color w:themeColor="text1" w:themeTint="bf" w:val="404040"/>
@@ -3876,7 +4389,7 @@
       <w:outlineLvl w:val="7"/>
     </w:pPr>
     <w:rPr>
-      <w:rFonts w:ascii="Calibri" w:hAnsi="Calibri" w:eastAsia="ＭＳ ゴシック" w:cs="" w:asciiTheme="majorHAnsi" w:cstheme="majorBidi" w:eastAsiaTheme="majorEastAsia" w:hAnsiTheme="majorHAnsi"/>
+      <w:rFonts w:ascii="Calibri" w:hAnsi="Calibri" w:eastAsia="" w:cs="" w:asciiTheme="majorHAnsi" w:cstheme="majorBidi" w:eastAsiaTheme="majorEastAsia" w:hAnsiTheme="majorHAnsi"/>
       <w:color w:themeColor="accent1" w:val="4F81BD"/>
       <w:sz w:val="20"/>
       <w:szCs w:val="20"/>
@@ -3899,7 +4412,7 @@
       <w:outlineLvl w:val="8"/>
     </w:pPr>
     <w:rPr>
-      <w:rFonts w:ascii="Calibri" w:hAnsi="Calibri" w:eastAsia="ＭＳ ゴシック" w:cs="" w:asciiTheme="majorHAnsi" w:cstheme="majorBidi" w:eastAsiaTheme="majorEastAsia" w:hAnsiTheme="majorHAnsi"/>
+      <w:rFonts w:ascii="Calibri" w:hAnsi="Calibri" w:eastAsia="" w:cs="" w:asciiTheme="majorHAnsi" w:cstheme="majorBidi" w:eastAsiaTheme="majorEastAsia" w:hAnsiTheme="majorHAnsi"/>
       <w:i/>
       <w:iCs/>
       <w:color w:themeColor="text1" w:themeTint="bf" w:val="404040"/>
@@ -3941,7 +4454,7 @@
     <w:qFormat/>
     <w:rsid w:val="00fc693f"/>
     <w:rPr>
-      <w:rFonts w:ascii="Calibri" w:hAnsi="Calibri" w:eastAsia="ＭＳ ゴシック" w:cs="" w:asciiTheme="majorHAnsi" w:cstheme="majorBidi" w:eastAsiaTheme="majorEastAsia" w:hAnsiTheme="majorHAnsi"/>
+      <w:rFonts w:ascii="Calibri" w:hAnsi="Calibri" w:eastAsia="" w:cs="" w:asciiTheme="majorHAnsi" w:cstheme="majorBidi" w:eastAsiaTheme="majorEastAsia" w:hAnsiTheme="majorHAnsi"/>
       <w:b/>
       <w:bCs/>
       <w:color w:themeColor="accent1" w:themeShade="bf" w:val="365F91"/>
@@ -3957,7 +4470,7 @@
     <w:qFormat/>
     <w:rsid w:val="00fc693f"/>
     <w:rPr>
-      <w:rFonts w:ascii="Calibri" w:hAnsi="Calibri" w:eastAsia="ＭＳ ゴシック" w:cs="" w:asciiTheme="majorHAnsi" w:cstheme="majorBidi" w:eastAsiaTheme="majorEastAsia" w:hAnsiTheme="majorHAnsi"/>
+      <w:rFonts w:ascii="Calibri" w:hAnsi="Calibri" w:eastAsia="" w:cs="" w:asciiTheme="majorHAnsi" w:cstheme="majorBidi" w:eastAsiaTheme="majorEastAsia" w:hAnsiTheme="majorHAnsi"/>
       <w:b/>
       <w:bCs/>
       <w:color w:themeColor="accent1" w:val="4F81BD"/>
@@ -3973,7 +4486,7 @@
     <w:qFormat/>
     <w:rsid w:val="00fc693f"/>
     <w:rPr>
-      <w:rFonts w:ascii="Calibri" w:hAnsi="Calibri" w:eastAsia="ＭＳ ゴシック" w:cs="" w:asciiTheme="majorHAnsi" w:cstheme="majorBidi" w:eastAsiaTheme="majorEastAsia" w:hAnsiTheme="majorHAnsi"/>
+      <w:rFonts w:ascii="Calibri" w:hAnsi="Calibri" w:eastAsia="" w:cs="" w:asciiTheme="majorHAnsi" w:cstheme="majorBidi" w:eastAsiaTheme="majorEastAsia" w:hAnsiTheme="majorHAnsi"/>
       <w:b/>
       <w:bCs/>
       <w:color w:themeColor="accent1" w:val="4F81BD"/>
@@ -3987,7 +4500,7 @@
     <w:qFormat/>
     <w:rsid w:val="00fc693f"/>
     <w:rPr>
-      <w:rFonts w:ascii="Calibri" w:hAnsi="Calibri" w:eastAsia="ＭＳ ゴシック" w:cs="" w:asciiTheme="majorHAnsi" w:cstheme="majorBidi" w:eastAsiaTheme="majorEastAsia" w:hAnsiTheme="majorHAnsi"/>
+      <w:rFonts w:ascii="Calibri" w:hAnsi="Calibri" w:eastAsia="" w:cs="" w:asciiTheme="majorHAnsi" w:cstheme="majorBidi" w:eastAsiaTheme="majorEastAsia" w:hAnsiTheme="majorHAnsi"/>
       <w:color w:themeColor="text2" w:themeShade="bf" w:val="17365D"/>
       <w:spacing w:val="5"/>
       <w:kern w:val="2"/>
@@ -4003,7 +4516,7 @@
     <w:qFormat/>
     <w:rsid w:val="00fc693f"/>
     <w:rPr>
-      <w:rFonts w:ascii="Calibri" w:hAnsi="Calibri" w:eastAsia="ＭＳ ゴシック" w:cs="" w:asciiTheme="majorHAnsi" w:cstheme="majorBidi" w:eastAsiaTheme="majorEastAsia" w:hAnsiTheme="majorHAnsi"/>
+      <w:rFonts w:ascii="Calibri" w:hAnsi="Calibri" w:eastAsia="" w:cs="" w:asciiTheme="majorHAnsi" w:cstheme="majorBidi" w:eastAsiaTheme="majorEastAsia" w:hAnsiTheme="majorHAnsi"/>
       <w:i/>
       <w:iCs/>
       <w:color w:themeColor="accent1" w:val="4F81BD"/>
@@ -4076,7 +4589,7 @@
     <w:qFormat/>
     <w:rsid w:val="00fc693f"/>
     <w:rPr>
-      <w:rFonts w:ascii="Calibri" w:hAnsi="Calibri" w:eastAsia="ＭＳ ゴシック" w:cs="" w:asciiTheme="majorHAnsi" w:cstheme="majorBidi" w:eastAsiaTheme="majorEastAsia" w:hAnsiTheme="majorHAnsi"/>
+      <w:rFonts w:ascii="Calibri" w:hAnsi="Calibri" w:eastAsia="" w:cs="" w:asciiTheme="majorHAnsi" w:cstheme="majorBidi" w:eastAsiaTheme="majorEastAsia" w:hAnsiTheme="majorHAnsi"/>
       <w:b/>
       <w:bCs/>
       <w:i/>
@@ -4093,7 +4606,7 @@
     <w:qFormat/>
     <w:rsid w:val="00fc693f"/>
     <w:rPr>
-      <w:rFonts w:ascii="Calibri" w:hAnsi="Calibri" w:eastAsia="ＭＳ ゴシック" w:cs="" w:asciiTheme="majorHAnsi" w:cstheme="majorBidi" w:eastAsiaTheme="majorEastAsia" w:hAnsiTheme="majorHAnsi"/>
+      <w:rFonts w:ascii="Calibri" w:hAnsi="Calibri" w:eastAsia="" w:cs="" w:asciiTheme="majorHAnsi" w:cstheme="majorBidi" w:eastAsiaTheme="majorEastAsia" w:hAnsiTheme="majorHAnsi"/>
       <w:color w:themeColor="accent1" w:themeShade="7f" w:val="243F60"/>
     </w:rPr>
   </w:style>
@@ -4106,7 +4619,7 @@
     <w:qFormat/>
     <w:rsid w:val="00fc693f"/>
     <w:rPr>
-      <w:rFonts w:ascii="Calibri" w:hAnsi="Calibri" w:eastAsia="ＭＳ ゴシック" w:cs="" w:asciiTheme="majorHAnsi" w:cstheme="majorBidi" w:eastAsiaTheme="majorEastAsia" w:hAnsiTheme="majorHAnsi"/>
+      <w:rFonts w:ascii="Calibri" w:hAnsi="Calibri" w:eastAsia="" w:cs="" w:asciiTheme="majorHAnsi" w:cstheme="majorBidi" w:eastAsiaTheme="majorEastAsia" w:hAnsiTheme="majorHAnsi"/>
       <w:i/>
       <w:iCs/>
       <w:color w:themeColor="accent1" w:themeShade="7f" w:val="243F60"/>
@@ -4121,7 +4634,7 @@
     <w:qFormat/>
     <w:rsid w:val="00fc693f"/>
     <w:rPr>
-      <w:rFonts w:ascii="Calibri" w:hAnsi="Calibri" w:eastAsia="ＭＳ ゴシック" w:cs="" w:asciiTheme="majorHAnsi" w:cstheme="majorBidi" w:eastAsiaTheme="majorEastAsia" w:hAnsiTheme="majorHAnsi"/>
+      <w:rFonts w:ascii="Calibri" w:hAnsi="Calibri" w:eastAsia="" w:cs="" w:asciiTheme="majorHAnsi" w:cstheme="majorBidi" w:eastAsiaTheme="majorEastAsia" w:hAnsiTheme="majorHAnsi"/>
       <w:i/>
       <w:iCs/>
       <w:color w:themeColor="text1" w:themeTint="bf" w:val="404040"/>
@@ -4136,7 +4649,7 @@
     <w:qFormat/>
     <w:rsid w:val="00fc693f"/>
     <w:rPr>
-      <w:rFonts w:ascii="Calibri" w:hAnsi="Calibri" w:eastAsia="ＭＳ ゴシック" w:cs="" w:asciiTheme="majorHAnsi" w:cstheme="majorBidi" w:eastAsiaTheme="majorEastAsia" w:hAnsiTheme="majorHAnsi"/>
+      <w:rFonts w:ascii="Calibri" w:hAnsi="Calibri" w:eastAsia="" w:cs="" w:asciiTheme="majorHAnsi" w:cstheme="majorBidi" w:eastAsiaTheme="majorEastAsia" w:hAnsiTheme="majorHAnsi"/>
       <w:color w:themeColor="accent1" w:val="4F81BD"/>
       <w:sz w:val="20"/>
       <w:szCs w:val="20"/>
@@ -4151,7 +4664,7 @@
     <w:qFormat/>
     <w:rsid w:val="00fc693f"/>
     <w:rPr>
-      <w:rFonts w:ascii="Calibri" w:hAnsi="Calibri" w:eastAsia="ＭＳ ゴシック" w:cs="" w:asciiTheme="majorHAnsi" w:cstheme="majorBidi" w:eastAsiaTheme="majorEastAsia" w:hAnsiTheme="majorHAnsi"/>
+      <w:rFonts w:ascii="Calibri" w:hAnsi="Calibri" w:eastAsia="" w:cs="" w:asciiTheme="majorHAnsi" w:cstheme="majorBidi" w:eastAsiaTheme="majorEastAsia" w:hAnsiTheme="majorHAnsi"/>
       <w:i/>
       <w:iCs/>
       <w:color w:themeColor="text1" w:themeTint="bf" w:val="404040"/>
@@ -4381,12 +4894,13 @@
     <w:rsid w:val="00fc693f"/>
     <w:pPr>
       <w:widowControl/>
+      <w:suppressAutoHyphens w:val="true"/>
       <w:bidi w:val="0"/>
       <w:spacing w:lineRule="auto" w:line="240" w:before="0" w:after="0"/>
       <w:jc w:val="start"/>
     </w:pPr>
     <w:rPr>
-      <w:rFonts w:ascii="Cambria" w:hAnsi="Cambria" w:eastAsia="ＭＳ 明朝" w:cs="" w:asciiTheme="minorHAnsi" w:cstheme="minorBidi" w:eastAsiaTheme="minorEastAsia" w:hAnsiTheme="minorHAnsi"/>
+      <w:rFonts w:ascii="Cambria" w:hAnsi="Cambria" w:eastAsia="" w:cs="" w:asciiTheme="minorHAnsi" w:cstheme="minorBidi" w:eastAsiaTheme="minorEastAsia" w:hAnsiTheme="minorHAnsi"/>
       <w:color w:val="auto"/>
       <w:kern w:val="0"/>
       <w:sz w:val="22"/>
@@ -4410,7 +4924,7 @@
       <w:contextualSpacing/>
     </w:pPr>
     <w:rPr>
-      <w:rFonts w:ascii="Calibri" w:hAnsi="Calibri" w:eastAsia="ＭＳ ゴシック" w:cs="" w:asciiTheme="majorHAnsi" w:cstheme="majorBidi" w:eastAsiaTheme="majorEastAsia" w:hAnsiTheme="majorHAnsi"/>
+      <w:rFonts w:ascii="Calibri" w:hAnsi="Calibri" w:eastAsia="" w:cs="" w:asciiTheme="majorHAnsi" w:cstheme="majorBidi" w:eastAsiaTheme="majorEastAsia" w:hAnsiTheme="majorHAnsi"/>
       <w:color w:themeColor="text2" w:themeShade="bf" w:val="17365D"/>
       <w:spacing w:val="5"/>
       <w:kern w:val="2"/>
@@ -4428,7 +4942,7 @@
     <w:rsid w:val="00fc693f"/>
     <w:pPr/>
     <w:rPr>
-      <w:rFonts w:ascii="Calibri" w:hAnsi="Calibri" w:eastAsia="ＭＳ ゴシック" w:cs="" w:asciiTheme="majorHAnsi" w:cstheme="majorBidi" w:eastAsiaTheme="majorEastAsia" w:hAnsiTheme="majorHAnsi"/>
+      <w:rFonts w:ascii="Calibri" w:hAnsi="Calibri" w:eastAsia="" w:cs="" w:asciiTheme="majorHAnsi" w:cstheme="majorBidi" w:eastAsiaTheme="majorEastAsia" w:hAnsiTheme="majorHAnsi"/>
       <w:i/>
       <w:iCs/>
       <w:color w:themeColor="accent1" w:val="4F81BD"/>
@@ -4661,12 +5175,13 @@
         <w:tab w:val="left" w:pos="3456" w:leader="none"/>
         <w:tab w:val="left" w:pos="4032" w:leader="none"/>
       </w:tabs>
+      <w:suppressAutoHyphens w:val="true"/>
       <w:bidi w:val="0"/>
       <w:spacing w:lineRule="auto" w:line="276" w:before="0" w:after="200"/>
       <w:jc w:val="start"/>
     </w:pPr>
     <w:rPr>
-      <w:rFonts w:ascii="Courier" w:hAnsi="Courier" w:eastAsia="ＭＳ 明朝" w:cs="" w:cstheme="minorBidi" w:eastAsiaTheme="minorEastAsia"/>
+      <w:rFonts w:ascii="Courier" w:hAnsi="Courier" w:eastAsia="" w:cs="" w:cstheme="minorBidi" w:eastAsiaTheme="minorEastAsia"/>
       <w:color w:val="auto"/>
       <w:kern w:val="0"/>
       <w:sz w:val="20"/>
@@ -7864,7 +8379,6 @@
       <w:pPr>
         <w:spacing w:before="0" w:after="0" w:line="240" w:lineRule="auto"/>
       </w:pPr>
-      <w:rPr/>
       <w:tblPr/>
       <w:tcPr>
         <w:tcBorders>
@@ -8010,7 +8524,6 @@
       <w:pPr>
         <w:spacing w:before="0" w:after="0" w:line="240" w:lineRule="auto"/>
       </w:pPr>
-      <w:rPr/>
       <w:tblPr/>
       <w:tcPr>
         <w:tcBorders>
@@ -8156,7 +8669,6 @@
       <w:pPr>
         <w:spacing w:before="0" w:after="0" w:line="240" w:lineRule="auto"/>
       </w:pPr>
-      <w:rPr/>
       <w:tblPr/>
       <w:tcPr>
         <w:tcBorders>
@@ -8302,7 +8814,6 @@
       <w:pPr>
         <w:spacing w:before="0" w:after="0" w:line="240" w:lineRule="auto"/>
       </w:pPr>
-      <w:rPr/>
       <w:tblPr/>
       <w:tcPr>
         <w:tcBorders>
@@ -8448,7 +8959,6 @@
       <w:pPr>
         <w:spacing w:before="0" w:after="0" w:line="240" w:lineRule="auto"/>
       </w:pPr>
-      <w:rPr/>
       <w:tblPr/>
       <w:tcPr>
         <w:tcBorders>
@@ -8594,7 +9104,6 @@
       <w:pPr>
         <w:spacing w:before="0" w:after="0" w:line="240" w:lineRule="auto"/>
       </w:pPr>
-      <w:rPr/>
       <w:tblPr/>
       <w:tcPr>
         <w:tcBorders>
@@ -8740,7 +9249,6 @@
       <w:pPr>
         <w:spacing w:before="0" w:after="0" w:line="240" w:lineRule="auto"/>
       </w:pPr>
-      <w:rPr/>
       <w:tblPr/>
       <w:tcPr>
         <w:tcBorders>

</xml_diff>

<commit_message>
Add ListUsers RPC and turn Moved By into a user picker; fix README
- Add ListUsers RPC (both proto copies, Application query/handler,
  IUserRepository.ListAsync, UserGrpcService) so the frontend can populate a
  dropdown instead of free-typing a user id. Returns the proto DTO
  (ListUsersResponse), never the domain model, matching the existing
  Account/Movement services' convention.
- Movement's Submit/Transfer "Moved By" field is now a dropdown showing
  "Name Surname (id)", storing the selected user's id — same pattern as the
  Account Id dropdown.
- Fix README: lead with the fastest run path, correct the stale
  run-dockerhub.ps1/run-local.ps1 descriptions (both now also start the WCF
  gateway/WPF client automatically), and fix the scripts/ path in the
  repository layout diagram.

Co-Authored-By: Claude Sonnet 5 <noreply@anthropic.com>
</commit_message>
<xml_diff>
--- a/docs/Sygnia-Design-Manual.docx
+++ b/docs/Sygnia-Design-Manual.docx
@@ -3186,7 +3186,7 @@
         <w:drawing>
           <wp:inline xmlns:a="http://schemas.openxmlformats.org/drawingml/2006/main">
             <wp:extent cx="5760720" cy="2592780"/>
-            <wp:docPr id="9" name="Picture 9"/>
+            <wp:docPr id="15" name="Picture 15"/>
             <wp:cNvGraphicFramePr>
               <a:graphicFrameLocks noChangeAspect="1"/>
             </wp:cNvGraphicFramePr>
@@ -3194,11 +3194,11 @@
               <a:graphicData uri="http://schemas.openxmlformats.org/drawingml/2006/picture">
                 <pic:pic>
                   <pic:nvPicPr>
-                    <pic:cNvPr id="0" name="angular-home.png"/>
+                    <pic:cNvPr id="0" name="new-home.png"/>
                     <pic:cNvPicPr/>
                   </pic:nvPicPr>
                   <pic:blipFill>
-                    <a:blip r:embed="rId15"/>
+                    <a:blip r:embed="rId21"/>
                     <a:stretch>
                       <a:fillRect/>
                     </a:stretch>
@@ -3244,7 +3244,7 @@
         <w:drawing>
           <wp:inline xmlns:a="http://schemas.openxmlformats.org/drawingml/2006/main">
             <wp:extent cx="5760720" cy="2592780"/>
-            <wp:docPr id="10" name="Picture 10"/>
+            <wp:docPr id="16" name="Picture 16"/>
             <wp:cNvGraphicFramePr>
               <a:graphicFrameLocks noChangeAspect="1"/>
             </wp:cNvGraphicFramePr>
@@ -3252,11 +3252,11 @@
               <a:graphicData uri="http://schemas.openxmlformats.org/drawingml/2006/picture">
                 <pic:pic>
                   <pic:nvPicPr>
-                    <pic:cNvPr id="0" name="angular-accounts.png"/>
+                    <pic:cNvPr id="0" name="new-accounts.png"/>
                     <pic:cNvPicPr/>
                   </pic:nvPicPr>
                   <pic:blipFill>
-                    <a:blip r:embed="rId16"/>
+                    <a:blip r:embed="rId22"/>
                     <a:stretch>
                       <a:fillRect/>
                     </a:stretch>
@@ -3291,7 +3291,7 @@
         <w:pStyle w:val="Heading2"/>
       </w:pPr>
       <w:r>
-        <w:t>12.3 User Actions — Submit Movement</w:t>
+        <w:t>12.3 Movement</w:t>
       </w:r>
     </w:p>
     <w:p>
@@ -3302,7 +3302,7 @@
         <w:drawing>
           <wp:inline xmlns:a="http://schemas.openxmlformats.org/drawingml/2006/main">
             <wp:extent cx="5760720" cy="2592780"/>
-            <wp:docPr id="11" name="Picture 11"/>
+            <wp:docPr id="17" name="Picture 17"/>
             <wp:cNvGraphicFramePr>
               <a:graphicFrameLocks noChangeAspect="1"/>
             </wp:cNvGraphicFramePr>
@@ -3310,11 +3310,11 @@
               <a:graphicData uri="http://schemas.openxmlformats.org/drawingml/2006/picture">
                 <pic:pic>
                   <pic:nvPicPr>
-                    <pic:cNvPr id="0" name="angular-user-submit-movement.png"/>
+                    <pic:cNvPr id="0" name="new-movement.png"/>
                     <pic:cNvPicPr/>
                   </pic:nvPicPr>
                   <pic:blipFill>
-                    <a:blip r:embed="rId17"/>
+                    <a:blip r:embed="rId23"/>
                     <a:stretch>
                       <a:fillRect/>
                     </a:stretch>
@@ -3341,7 +3341,7 @@
         <w:rPr>
           <w:i/>
         </w:rPr>
-        <w:t>Submit Movement tab: account and currency are dropdowns populated from live data, not free text.</w:t>
+        <w:t>Movement is now its own top-level page (was a User Actions tab). Account and currency are dropdowns populated from live data, not free text.</w:t>
       </w:r>
     </w:p>
     <w:p>
@@ -3349,7 +3349,7 @@
         <w:pStyle w:val="Heading2"/>
       </w:pPr>
       <w:r>
-        <w:t>12.4 User Actions — Balance</w:t>
+        <w:t>12.4 Balance</w:t>
       </w:r>
     </w:p>
     <w:p>
@@ -3360,7 +3360,7 @@
         <w:drawing>
           <wp:inline xmlns:a="http://schemas.openxmlformats.org/drawingml/2006/main">
             <wp:extent cx="5760720" cy="2592780"/>
-            <wp:docPr id="12" name="Picture 12"/>
+            <wp:docPr id="18" name="Picture 18"/>
             <wp:cNvGraphicFramePr>
               <a:graphicFrameLocks noChangeAspect="1"/>
             </wp:cNvGraphicFramePr>
@@ -3368,11 +3368,11 @@
               <a:graphicData uri="http://schemas.openxmlformats.org/drawingml/2006/picture">
                 <pic:pic>
                   <pic:nvPicPr>
-                    <pic:cNvPr id="0" name="angular-user-balance.png"/>
+                    <pic:cNvPr id="0" name="new-balance.png"/>
                     <pic:cNvPicPr/>
                   </pic:nvPicPr>
                   <pic:blipFill>
-                    <a:blip r:embed="rId18"/>
+                    <a:blip r:embed="rId24"/>
                     <a:stretch>
                       <a:fillRect/>
                     </a:stretch>
@@ -3399,7 +3399,7 @@
         <w:rPr>
           <w:i/>
         </w:rPr>
-        <w:t>Balance tab: current balance for ACC-001, computed on read from the movement ledger.</w:t>
+        <w:t>Balance is now its own top-level page. Current balance for ACC-001, computed on read from the movement ledger; amounts render as monospace ledger numerals, colour-coded by sign.</w:t>
       </w:r>
     </w:p>
     <w:p>
@@ -3418,7 +3418,7 @@
         <w:drawing>
           <wp:inline xmlns:a="http://schemas.openxmlformats.org/drawingml/2006/main">
             <wp:extent cx="5760720" cy="2592780"/>
-            <wp:docPr id="13" name="Picture 13"/>
+            <wp:docPr id="19" name="Picture 19"/>
             <wp:cNvGraphicFramePr>
               <a:graphicFrameLocks noChangeAspect="1"/>
             </wp:cNvGraphicFramePr>
@@ -3426,11 +3426,11 @@
               <a:graphicData uri="http://schemas.openxmlformats.org/drawingml/2006/picture">
                 <pic:pic>
                   <pic:nvPicPr>
-                    <pic:cNvPr id="0" name="angular-statement-search.png"/>
+                    <pic:cNvPr id="0" name="new-statement.png"/>
                     <pic:cNvPicPr/>
                   </pic:nvPicPr>
                   <pic:blipFill>
-                    <a:blip r:embed="rId19"/>
+                    <a:blip r:embed="rId25"/>
                     <a:stretch>
                       <a:fillRect/>
                     </a:stretch>
@@ -3476,7 +3476,7 @@
         <w:drawing>
           <wp:inline xmlns:a="http://schemas.openxmlformats.org/drawingml/2006/main">
             <wp:extent cx="5760720" cy="2592780"/>
-            <wp:docPr id="14" name="Picture 14"/>
+            <wp:docPr id="20" name="Picture 20"/>
             <wp:cNvGraphicFramePr>
               <a:graphicFrameLocks noChangeAspect="1"/>
             </wp:cNvGraphicFramePr>
@@ -3484,11 +3484,11 @@
               <a:graphicData uri="http://schemas.openxmlformats.org/drawingml/2006/picture">
                 <pic:pic>
                   <pic:nvPicPr>
-                    <pic:cNvPr id="0" name="angular-statement-stream-pdf-toast.png"/>
+                    <pic:cNvPr id="0" name="new-statement-stream-toast.png"/>
                     <pic:cNvPicPr/>
                   </pic:nvPicPr>
                   <pic:blipFill>
-                    <a:blip r:embed="rId20"/>
+                    <a:blip r:embed="rId26"/>
                     <a:stretch>
                       <a:fillRect/>
                     </a:stretch>

</xml_diff>